<commit_message>
Paper/slides: drop self-citation of the thesis (this paper is the thesis); describe CE-SE setup and comb in-paper
Co-Authored-By: Claude Opus 5.5 (1M context) <noreply@anthropic.com>
</commit_message>
<xml_diff>
--- a/results/paper_asj_2026-10.docx
+++ b/results/paper_asj_2026-10.docx
@@ -104,7 +104,7 @@
           <w:sz w:val="20"/>
           <w:szCs w:val="20"/>
         </w:rPr>
-        <w:t xml:space="preserve">前処理としての音声強調（SE）は有力な対策であるが、知覚品質の改善が音声認識（ASR）の改善を保証しないことが知られている[3]。この乖離に対し、凍結したASRの損失でSEを学習する方法が提案されてきた[4,5]。著者らも喉マイクSEをWhisper-smallの交差エントロピー（CE）損失で追加学習し、WhisperではCERが下がる一方、入力特徴量の異なるCTC型認識器では悪化することを報告した。すなわちASR損失で学習したSEは、損失に用いた認識器の入力特徴量に特化する。</w:t>
+        <w:t xml:space="preserve">前処理としての音声強調（SE）は有力な対策であるが、知覚品質の改善が音声認識（ASR）の改善を保証しないことが知られている[3]。この乖離に対し、凍結したASRの損失でSEを学習する方法が提案されてきた[4,5]。しかし、損失に用いた認識器以外への効果は十分に調べられていない。本稿の実験でも、Whisper-smallの交差エントロピー（CE）損失で学習した喉マイクSEは、WhisperではCERを下げる一方、入力特徴量の異なる認識器では悪化した（4.1節）。ASR損失で学習したSEは、損失に用いた認識器の入力特徴量に特化しうる。</w:t>
       </w:r>
     </w:p>
     <w:p>
@@ -117,7 +117,7 @@
           <w:sz w:val="20"/>
           <w:szCs w:val="20"/>
         </w:rPr>
-        <w:t xml:space="preserve">一方、喉マイクの問題は雑音の混入ではなく帯域や子音の欠落であり、欠けた成分を補う必要がある。大規模音声で事前学習した生成モデル[6]は、入力が持たない成分を自然な音声として生成できる。体内伝導マイクではこの種の生成モデルの適応が有効との報告がある[17]が、評価は単一の認識器に限られる。また、生成的な帯域拡張や声質変換が喉マイク音声のCERを悪化させたという報告もある[8]。</w:t>
+        <w:t xml:space="preserve">一方、喉マイクの問題は雑音の混入ではなく帯域や子音の欠落であり、欠けた成分を補う必要がある。大規模音声で事前学習した生成モデル[6]は、入力が持たない成分を自然な音声として生成できる。体内伝導マイクではこの種の生成モデルの適応が有効との報告がある[16]が、評価は単一の認識器に限られる。また、生成的な帯域拡張や声質変換が喉マイク音声のCERを悪化させたという報告もある[8]。</w:t>
       </w:r>
     </w:p>
     <w:p>
@@ -632,7 +632,7 @@
           <w:sz w:val="20"/>
           <w:szCs w:val="20"/>
         </w:rPr>
-        <w:t xml:space="preserve"> = 10（devのCERで選択）とした。</w:t>
+        <w:t xml:space="preserve">はdevのCERで{0, 0.1, 0.5, 1, 2, 5, 10}から選んで10とした。</w:t>
       </w:r>
     </w:p>
     <w:p>
@@ -935,7 +935,7 @@
           <w:sz w:val="20"/>
           <w:szCs w:val="20"/>
         </w:rPr>
-        <w:t xml:space="preserve">、EMA、32ビット浮動小数点）。モデルの選択には最終ステップを用い、testを見て選んでいない。CE-SEは文献[10]の設定（Adam、学習率3×10</w:t>
+        <w:t xml:space="preserve">、EMA、32ビット浮動小数点）。モデルの選択には最終ステップを用い、testを見て選んでいない。CE-SEはAdam（学習率3×10</w:t>
       </w:r>
       <w:r>
         <w:rPr>
@@ -952,7 +952,7 @@
           <w:sz w:val="20"/>
           <w:szCs w:val="20"/>
         </w:rPr>
-        <w:t xml:space="preserve">、batch 4）で学習した。</w:t>
+        <w:t xml:space="preserve">、batch 4）で最大50エポック学習し、devの損失でearly stoppingを行った。15秒を超える発話は学習から除外した。</w:t>
       </w:r>
     </w:p>
     <w:p>
@@ -982,7 +982,7 @@
           <w:sz w:val="20"/>
           <w:szCs w:val="20"/>
         </w:rPr>
-        <w:t xml:space="preserve">TAPS SE、CE-SEに加え、2つの既存手法を比較した。SSL-MSEは、SE出力と気導音声のWavLM-Large[11]全層の表現の二乗誤差を再構成損失に加えてTAPS SEを追加学習したもので、Satoら[5]の方式に従う。Dissen型は、凍結したASRの損失で前段を学習する方法[4]に倣い、喉マイクの対数メルスペクトログラムを入力・出力とするU-Net（約700万パラメータ）を、Whisper-smallのCEと気導音声の対数メルへのL1損失で学習したものである。</w:t>
+        <w:t xml:space="preserve">TAPS SE、CE-SEに加え、2つの既存手法を比較した。SSL-MSEは、SE出力と気導音声のWavLM-Large[10]全層の表現の二乗誤差を再構成損失に加えてTAPS SEを追加学習したもので、Satoら[5]の方式に従う。Dissen型は、凍結したASRの損失で前段を学習する方法[4]に倣い、喉マイクの対数メルスペクトログラムを入力・出力とするU-Net（約700万パラメータ）を、Whisper-smallのCEと気導音声の対数メルへのL1損失で学習したものである。</w:t>
       </w:r>
     </w:p>
     <w:p>
@@ -1045,7 +1045,7 @@
           <w:sz w:val="20"/>
           <w:szCs w:val="20"/>
         </w:rPr>
-        <w:t xml:space="preserve">Whisper系への特化を確認する対照として、波形入力のCTC型であるMMS-1B[12]とXLS-R[13]（韓国語で追加学習したもの）、Kaldi型のフィルタバンクを入力とするZipformer[14]を用いた。</w:t>
+        <w:t xml:space="preserve">Whisper系への特化を確認する対照として、波形入力のCTC型であるMMS-1B[11]とXLS-R[12]（韓国語で追加学習したもの）、Kaldi型のフィルタバンクを入力とするZipformer[13]を用いた。</w:t>
       </w:r>
     </w:p>
     <w:p>
@@ -3606,7 +3606,7 @@
       <w:r>
         <w:drawing>
           <wp:inline distT="0" distB="0" distL="0" distR="0">
-            <wp:extent cx="2762250" cy="2514600"/>
+            <wp:extent cx="2381250" cy="2171700"/>
             <wp:effectExtent t="0" r="0" b="0" l="0"/>
             <wp:docPr id="1" name="" descr="" title=""/>
             <wp:cNvGraphicFramePr>
@@ -3631,7 +3631,7 @@
                   <pic:spPr bwMode="auto">
                     <a:xfrm>
                       <a:off x="0" y="0"/>
-                      <a:ext cx="2762250" cy="2514600"/>
+                      <a:ext cx="2381250" cy="2171700"/>
                     </a:xfrm>
                     <a:prstGeom prst="rect">
                       <a:avLst/>
@@ -3904,7 +3904,7 @@
           <w:sz w:val="20"/>
           <w:szCs w:val="20"/>
         </w:rPr>
-        <w:t xml:space="preserve">にCEをかけて追加学習すると、見積もりのCEは下がるが、20段で生成した出力のCERは悪化した。CEなしで同じ手順をとると悪化しないため、原因はCE損失にある。最終段のみに損失をかけるDRaFT-K[15]型の学習、生成出力に小さな補正モジュールを加える方法も効果がなかった。CE-SEを融合後の音に対するCEで再学習すると、Whisper系では一貫して改善したが、幅は0.2〜1.9%にとどまった。</w:t>
+        <w:t xml:space="preserve">にCEをかけて追加学習すると、見積もりのCEは下がるが、20段で生成した出力のCERは悪化した。CEなしで同じ手順をとると悪化しないため、原因はCE損失にある。最終段のみに損失をかけるDRaFT-K[14]型の学習、生成出力に小さな補正モジュールを加える方法も効果がなかった。CE-SEを融合後の音に対するCEで再学習すると、Whisper系では一貫して改善したが、幅は0.2〜1.9%にとどまった。</w:t>
       </w:r>
     </w:p>
     <w:p>
@@ -4454,7 +4454,7 @@
           <w:sz w:val="20"/>
           <w:szCs w:val="20"/>
         </w:rPr>
-        <w:t xml:space="preserve">CE-SEの何がWhisper系に効くのかを、融合の作り方を変えて調べた（表3）。CE-SEの出力には250 Hz間隔の櫛状のピークが現れることが分かっている[10]が、このピークをノッチで除いてから融合しても結果はほぼ変わらず、上乗せの原因ではなかった。4 kHz未満のみ、または4 kHz以上のみを融合すると、Whisper系の上乗せはそれぞれ約半分になり、両帯域から生じていた。一方、Zipformerは4 kHz未満のみの融合では悪化せず、悪化の原因はCE-SEが作る4 kHz以上の成分であった。喉マイクに元々存在しない帯域に、Whisper向けに作られた成分が、Kaldi型の特徴量を用いる認識器には害となっている。帯域ごとに重みを変えた12通りをdevで比較しても差は1%前後で、</w:t>
+        <w:t xml:space="preserve">CE-SEの何がWhisper系に効くのかを、融合の作り方を変えて調べた（表3）。CE-SEの出力には、3〜7.75 kHzの250 Hz間隔の位置に鋭いピークが並ぶ櫛状の成分が現れる。このピークをノッチで除いてから融合しても結果はほぼ変わらず、上乗せの原因ではなかった。4 kHz未満のみ、または4 kHz以上のみを融合すると、Whisper系の上乗せはそれぞれ約半分になり、両帯域から生じていた。一方、Zipformerは4 kHz未満のみの融合では悪化せず、悪化の原因はCE-SEが作る4 kHz以上の成分であった。喉マイクに元々存在しない帯域に、Whisper向けに作られた成分が、Kaldi型の特徴量を用いる認識器には害となっている。帯域ごとに重みを変えた12通りをdevで比較しても差は1%前後で、</w:t>
       </w:r>
       <w:r>
         <w:rPr>
@@ -5764,7 +5764,7 @@
           <w:sz w:val="20"/>
           <w:szCs w:val="20"/>
         </w:rPr>
-        <w:t xml:space="preserve">ASRの学習に用いていない表現であるHuBERT-Large[16]の全層について、同一発話の気導音声とのフレームごとのコサイン距離を求めた。これまでに評価した17条件をまたぐと、この距離は9認識器のうち最も悪化した認識器のCER変化と強く相関した（Spearman </w:t>
+        <w:t xml:space="preserve">ASRの学習に用いていない表現であるHuBERT-Large[15]の全層について、同一発話の気導音声とのフレームごとのコサイン距離を求めた。これまでに評価した17条件をまたぐと、この距離は9認識器のうち最も悪化した認識器のCER変化と強く相関した（Spearman </w:t>
       </w:r>
       <w:r>
         <w:rPr>
@@ -5921,7 +5921,7 @@
     </w:p>
     <w:p>
       <w:pPr>
-        <w:spacing w:after="10" w:line="250"/>
+        <w:spacing w:after="0" w:line="230"/>
       </w:pPr>
       <w:r>
         <w:rPr>
@@ -5934,7 +5934,7 @@
     </w:p>
     <w:p>
       <w:pPr>
-        <w:spacing w:after="10" w:line="250"/>
+        <w:spacing w:after="0" w:line="230"/>
       </w:pPr>
       <w:r>
         <w:rPr>
@@ -5947,7 +5947,7 @@
     </w:p>
     <w:p>
       <w:pPr>
-        <w:spacing w:after="10" w:line="250"/>
+        <w:spacing w:after="0" w:line="230"/>
       </w:pPr>
       <w:r>
         <w:rPr>
@@ -5960,7 +5960,7 @@
     </w:p>
     <w:p>
       <w:pPr>
-        <w:spacing w:after="10" w:line="250"/>
+        <w:spacing w:after="0" w:line="230"/>
       </w:pPr>
       <w:r>
         <w:rPr>
@@ -5973,7 +5973,7 @@
     </w:p>
     <w:p>
       <w:pPr>
-        <w:spacing w:after="10" w:line="250"/>
+        <w:spacing w:after="0" w:line="230"/>
       </w:pPr>
       <w:r>
         <w:rPr>
@@ -5986,7 +5986,7 @@
     </w:p>
     <w:p>
       <w:pPr>
-        <w:spacing w:after="10" w:line="250"/>
+        <w:spacing w:after="0" w:line="230"/>
       </w:pPr>
       <w:r>
         <w:rPr>
@@ -5999,7 +5999,7 @@
     </w:p>
     <w:p>
       <w:pPr>
-        <w:spacing w:after="10" w:line="250"/>
+        <w:spacing w:after="0" w:line="230"/>
       </w:pPr>
       <w:r>
         <w:rPr>
@@ -6012,7 +6012,7 @@
     </w:p>
     <w:p>
       <w:pPr>
-        <w:spacing w:after="10" w:line="250"/>
+        <w:spacing w:after="0" w:line="230"/>
       </w:pPr>
       <w:r>
         <w:rPr>
@@ -6025,7 +6025,7 @@
     </w:p>
     <w:p>
       <w:pPr>
-        <w:spacing w:after="10" w:line="250"/>
+        <w:spacing w:after="0" w:line="230"/>
       </w:pPr>
       <w:r>
         <w:rPr>
@@ -6038,7 +6038,7 @@
     </w:p>
     <w:p>
       <w:pPr>
-        <w:spacing w:after="10" w:line="250"/>
+        <w:spacing w:after="0" w:line="230"/>
       </w:pPr>
       <w:r>
         <w:rPr>
@@ -6046,12 +6046,12 @@
           <w:sz w:val="16"/>
           <w:szCs w:val="16"/>
         </w:rPr>
-        <w:t xml:space="preserve">[10] 春日, “ASR損失で学習した喉マイク音声強調の効果と汎化範囲,” 卒業論文（準備中）, 2026.</w:t>
-      </w:r>
-    </w:p>
-    <w:p>
-      <w:pPr>
-        <w:spacing w:after="10" w:line="250"/>
+        <w:t xml:space="preserve">[10] S. Chen et al., “WavLM: Large-scale self-supervised pre-training for full stack speech processing,” IEEE JSTSP, vol. 16, 2022.</w:t>
+      </w:r>
+    </w:p>
+    <w:p>
+      <w:pPr>
+        <w:spacing w:after="0" w:line="230"/>
       </w:pPr>
       <w:r>
         <w:rPr>
@@ -6059,12 +6059,12 @@
           <w:sz w:val="16"/>
           <w:szCs w:val="16"/>
         </w:rPr>
-        <w:t xml:space="preserve">[11] S. Chen et al., “WavLM: Large-scale self-supervised pre-training for full stack speech processing,” IEEE JSTSP, vol. 16, 2022.</w:t>
-      </w:r>
-    </w:p>
-    <w:p>
-      <w:pPr>
-        <w:spacing w:after="10" w:line="250"/>
+        <w:t xml:space="preserve">[11] V. Pratap et al., “Scaling speech technology to 1,000+ languages,” JMLR, vol. 25, 2024.</w:t>
+      </w:r>
+    </w:p>
+    <w:p>
+      <w:pPr>
+        <w:spacing w:after="0" w:line="230"/>
       </w:pPr>
       <w:r>
         <w:rPr>
@@ -6072,12 +6072,12 @@
           <w:sz w:val="16"/>
           <w:szCs w:val="16"/>
         </w:rPr>
-        <w:t xml:space="preserve">[12] V. Pratap et al., “Scaling speech technology to 1,000+ languages,” JMLR, vol. 25, 2024.</w:t>
-      </w:r>
-    </w:p>
-    <w:p>
-      <w:pPr>
-        <w:spacing w:after="10" w:line="250"/>
+        <w:t xml:space="preserve">[12] A. Babu et al., “XLS-R: Self-supervised cross-lingual speech representation learning at scale,” Proc. Interspeech, 2022.</w:t>
+      </w:r>
+    </w:p>
+    <w:p>
+      <w:pPr>
+        <w:spacing w:after="0" w:line="230"/>
       </w:pPr>
       <w:r>
         <w:rPr>
@@ -6085,12 +6085,12 @@
           <w:sz w:val="16"/>
           <w:szCs w:val="16"/>
         </w:rPr>
-        <w:t xml:space="preserve">[13] A. Babu et al., “XLS-R: Self-supervised cross-lingual speech representation learning at scale,” Proc. Interspeech, 2022.</w:t>
-      </w:r>
-    </w:p>
-    <w:p>
-      <w:pPr>
-        <w:spacing w:after="10" w:line="250"/>
+        <w:t xml:space="preserve">[13] Z. Yao et al., “Zipformer: A faster and better encoder for automatic speech recognition,” Proc. ICLR, 2024.</w:t>
+      </w:r>
+    </w:p>
+    <w:p>
+      <w:pPr>
+        <w:spacing w:after="0" w:line="230"/>
       </w:pPr>
       <w:r>
         <w:rPr>
@@ -6098,12 +6098,12 @@
           <w:sz w:val="16"/>
           <w:szCs w:val="16"/>
         </w:rPr>
-        <w:t xml:space="preserve">[14] Z. Yao et al., “Zipformer: A faster and better encoder for automatic speech recognition,” Proc. ICLR, 2024.</w:t>
-      </w:r>
-    </w:p>
-    <w:p>
-      <w:pPr>
-        <w:spacing w:after="10" w:line="250"/>
+        <w:t xml:space="preserve">[14] K. Clark et al., “Directly fine-tuning diffusion models on differentiable rewards,” Proc. ICLR, 2024.</w:t>
+      </w:r>
+    </w:p>
+    <w:p>
+      <w:pPr>
+        <w:spacing w:after="0" w:line="230"/>
       </w:pPr>
       <w:r>
         <w:rPr>
@@ -6111,12 +6111,12 @@
           <w:sz w:val="16"/>
           <w:szCs w:val="16"/>
         </w:rPr>
-        <w:t xml:space="preserve">[15] K. Clark et al., “Directly fine-tuning diffusion models on differentiable rewards,” Proc. ICLR, 2024.</w:t>
-      </w:r>
-    </w:p>
-    <w:p>
-      <w:pPr>
-        <w:spacing w:after="10" w:line="250"/>
+        <w:t xml:space="preserve">[15] W.-N. Hsu et al., “HuBERT: Self-supervised speech representation learning by masked prediction of hidden units,” IEEE/ACM TASLP, vol. 29, 2021.</w:t>
+      </w:r>
+    </w:p>
+    <w:p>
+      <w:pPr>
+        <w:spacing w:after="0" w:line="230"/>
       </w:pPr>
       <w:r>
         <w:rPr>
@@ -6124,20 +6124,7 @@
           <w:sz w:val="16"/>
           <w:szCs w:val="16"/>
         </w:rPr>
-        <w:t xml:space="preserve">[16] W.-N. Hsu et al., “HuBERT: Self-supervised speech representation learning by masked prediction of hidden units,” IEEE/ACM TASLP, vol. 29, 2021.</w:t>
-      </w:r>
-    </w:p>
-    <w:p>
-      <w:pPr>
-        <w:spacing w:after="10" w:line="250"/>
-      </w:pPr>
-      <w:r>
-        <w:rPr>
-          <w:rFonts w:ascii="MS Mincho" w:cs="MS Mincho" w:eastAsia="MS Mincho" w:hAnsi="MS Mincho"/>
-          <w:sz w:val="16"/>
-          <w:szCs w:val="16"/>
-        </w:rPr>
-        <w:t xml:space="preserve">[17] J. Hauret et al., arXiv:2508.02974, 2025.</w:t>
+        <w:t xml:space="preserve">[16] J. Hauret et al., arXiv:2508.02974, 2025.</w:t>
       </w:r>
     </w:p>
     <w:sectPr>

</xml_diff>